<commit_message>
Update templates and components
</commit_message>
<xml_diff>
--- a/backend-exhibits/slack-to-teams-advanced-plan-notincluded.docx
+++ b/backend-exhibits/slack-to-teams-advanced-plan-notincluded.docx
@@ -16,7 +16,6 @@
         <w:tblCellMar>
           <w:top w:w="140" w:type="dxa"/>
           <w:left w:w="109" w:type="dxa"/>
-          <w:bottom w:w="0" w:type="dxa"/>
           <w:right w:w="115" w:type="dxa"/>
         </w:tblCellMar>
         <w:tblLook w:val="04A0" w:firstRow="1" w:lastRow="0" w:firstColumn="1" w:lastColumn="0" w:noHBand="0" w:noVBand="1"/>
@@ -27,36 +26,23 @@
       </w:tblGrid>
       <w:tr>
         <w:trPr>
-          <w:trHeight w:val="566"/>
+          <w:trHeight w:val="403"/>
         </w:trPr>
         <w:tc>
           <w:tcPr>
-            <w:tcW w:w="2878" w:type="dxa"/>
-            <w:tcBorders>
-              <w:top w:val="single" w:sz="6" w:space="0" w:color="666666"/>
-              <w:left w:val="single" w:sz="6" w:space="0" w:color="666666"/>
-              <w:bottom w:val="single" w:sz="6" w:space="0" w:color="666666"/>
-              <w:right w:val="single" w:sz="6" w:space="0" w:color="666666"/>
-            </w:tcBorders>
-            <w:shd w:val="clear" w:color="auto" w:fill="EFEFEF"/>
-          </w:tcPr>
-          <w:p/>
-        </w:tc>
-        <w:tc>
-          <w:tcPr>
-            <w:tcW w:w="7843" w:type="dxa"/>
-            <w:tcBorders>
-              <w:top w:val="single" w:sz="6" w:space="0" w:color="666666"/>
-              <w:left w:val="single" w:sz="6" w:space="0" w:color="666666"/>
-              <w:bottom w:val="single" w:sz="6" w:space="0" w:color="666666"/>
-              <w:right w:val="single" w:sz="6" w:space="0" w:color="666666"/>
-            </w:tcBorders>
-            <w:shd w:val="clear" w:color="auto" w:fill="EFEFEF"/>
-            <w:vAlign w:val="center"/>
+            <w:tcW w:w="10721" w:type="dxa"/>
+            <w:gridSpan w:val="2"/>
+            <w:tcBorders>
+              <w:top w:val="single" w:sz="6" w:space="0" w:color="666666"/>
+              <w:left w:val="single" w:sz="6" w:space="0" w:color="666666"/>
+              <w:bottom w:val="single" w:sz="6" w:space="0" w:color="666666"/>
+              <w:right w:val="single" w:sz="6" w:space="0" w:color="666666"/>
+            </w:tcBorders>
+            <w:shd w:val="clear" w:color="auto" w:fill="808080" w:themeFill="background1" w:themeFillShade="80"/>
           </w:tcPr>
           <w:p>
             <w:pPr>
-              <w:spacing w:after="0"/>
+              <w:jc w:val="center"/>
             </w:pPr>
             <w:r>
               <w:rPr>
@@ -70,7 +56,7 @@
       </w:tr>
       <w:tr>
         <w:trPr>
-          <w:trHeight w:val="857"/>
+          <w:trHeight w:val="553"/>
         </w:trPr>
         <w:tc>
           <w:tcPr>
@@ -84,7 +70,6 @@
           </w:tcPr>
           <w:p>
             <w:pPr>
-              <w:spacing w:after="0"/>
               <w:ind w:left="2"/>
             </w:pPr>
             <w:r>
@@ -109,9 +94,6 @@
             <w:vAlign w:val="center"/>
           </w:tcPr>
           <w:p>
-            <w:pPr>
-              <w:spacing w:after="0"/>
-            </w:pPr>
             <w:r>
               <w:rPr>
                 <w:rFonts w:ascii="Arial" w:eastAsia="Arial" w:hAnsi="Arial" w:cs="Arial"/>
@@ -124,7 +106,7 @@
       </w:tr>
       <w:tr>
         <w:trPr>
-          <w:trHeight w:val="540"/>
+          <w:trHeight w:val="278"/>
         </w:trPr>
         <w:tc>
           <w:tcPr>
@@ -139,7 +121,6 @@
           </w:tcPr>
           <w:p>
             <w:pPr>
-              <w:spacing w:after="0"/>
               <w:ind w:left="2"/>
             </w:pPr>
             <w:r>
@@ -164,9 +145,6 @@
             <w:vAlign w:val="center"/>
           </w:tcPr>
           <w:p>
-            <w:pPr>
-              <w:spacing w:after="0"/>
-            </w:pPr>
             <w:r>
               <w:rPr>
                 <w:rFonts w:ascii="Arial" w:eastAsia="Arial" w:hAnsi="Arial" w:cs="Arial"/>
@@ -179,7 +157,7 @@
       </w:tr>
       <w:tr>
         <w:trPr>
-          <w:trHeight w:val="540"/>
+          <w:trHeight w:val="256"/>
         </w:trPr>
         <w:tc>
           <w:tcPr>
@@ -194,7 +172,6 @@
           </w:tcPr>
           <w:p>
             <w:pPr>
-              <w:spacing w:after="0"/>
               <w:ind w:left="2"/>
             </w:pPr>
             <w:r>
@@ -219,47 +196,19 @@
             <w:vAlign w:val="center"/>
           </w:tcPr>
           <w:p>
-            <w:pPr>
-              <w:spacing w:after="0"/>
-            </w:pPr>
-            <w:proofErr w:type="spellStart"/>
             <w:r>
               <w:rPr>
                 <w:rFonts w:ascii="Arial" w:eastAsia="Arial" w:hAnsi="Arial" w:cs="Arial"/>
                 <w:sz w:val="21"/>
               </w:rPr>
-              <w:t>Reactions</w:t>
-            </w:r>
-            <w:proofErr w:type="spellEnd"/>
-            <w:r>
-              <w:rPr>
-                <w:rFonts w:ascii="Arial" w:eastAsia="Arial" w:hAnsi="Arial" w:cs="Arial"/>
-                <w:sz w:val="21"/>
-              </w:rPr>
-              <w:t xml:space="preserve"> of </w:t>
-            </w:r>
-            <w:proofErr w:type="spellStart"/>
-            <w:r>
-              <w:rPr>
-                <w:rFonts w:ascii="Arial" w:eastAsia="Arial" w:hAnsi="Arial" w:cs="Arial"/>
-                <w:sz w:val="21"/>
-              </w:rPr>
-              <w:t>messages</w:t>
-            </w:r>
-            <w:proofErr w:type="spellEnd"/>
-            <w:r>
-              <w:rPr>
-                <w:rFonts w:ascii="Arial" w:eastAsia="Arial" w:hAnsi="Arial" w:cs="Arial"/>
-                <w:sz w:val="21"/>
-              </w:rPr>
-              <w:t xml:space="preserve"> will not be maintained</w:t>
+              <w:t>Reactions of messages will not be maintained</w:t>
             </w:r>
           </w:p>
         </w:tc>
       </w:tr>
       <w:tr>
         <w:trPr>
-          <w:trHeight w:val="855"/>
+          <w:trHeight w:val="418"/>
         </w:trPr>
         <w:tc>
           <w:tcPr>
@@ -273,7 +222,6 @@
           </w:tcPr>
           <w:p>
             <w:pPr>
-              <w:spacing w:after="0"/>
               <w:ind w:left="2"/>
             </w:pPr>
             <w:r>
@@ -298,38 +246,19 @@
             <w:vAlign w:val="center"/>
           </w:tcPr>
           <w:p>
-            <w:pPr>
-              <w:spacing w:after="0"/>
-            </w:pPr>
             <w:r>
               <w:rPr>
                 <w:rFonts w:ascii="Arial" w:eastAsia="Arial" w:hAnsi="Arial" w:cs="Arial"/>
                 <w:sz w:val="21"/>
               </w:rPr>
-              <w:t xml:space="preserve">We cannot migrate dm's </w:t>
-            </w:r>
-            <w:proofErr w:type="spellStart"/>
-            <w:r>
-              <w:rPr>
-                <w:rFonts w:ascii="Arial" w:eastAsia="Arial" w:hAnsi="Arial" w:cs="Arial"/>
-                <w:sz w:val="21"/>
-              </w:rPr>
-              <w:t>associated</w:t>
-            </w:r>
-            <w:proofErr w:type="spellEnd"/>
-            <w:r>
-              <w:rPr>
-                <w:rFonts w:ascii="Arial" w:eastAsia="Arial" w:hAnsi="Arial" w:cs="Arial"/>
-                <w:sz w:val="21"/>
-              </w:rPr>
-              <w:t xml:space="preserve"> with deactivated users (User need to be activated).</w:t>
+              <w:t>We cannot migrate dm's associated with deactivated users (User need to be activated).</w:t>
             </w:r>
           </w:p>
         </w:tc>
       </w:tr>
       <w:tr>
         <w:trPr>
-          <w:trHeight w:val="555"/>
+          <w:trHeight w:val="300"/>
         </w:trPr>
         <w:tc>
           <w:tcPr>
@@ -344,7 +273,6 @@
           </w:tcPr>
           <w:p>
             <w:pPr>
-              <w:spacing w:after="0"/>
               <w:ind w:left="2"/>
             </w:pPr>
             <w:r>
@@ -368,9 +296,6 @@
             <w:vAlign w:val="center"/>
           </w:tcPr>
           <w:p>
-            <w:pPr>
-              <w:spacing w:after="0"/>
-            </w:pPr>
             <w:r>
               <w:rPr>
                 <w:rFonts w:ascii="Arial" w:eastAsia="Arial" w:hAnsi="Arial" w:cs="Arial"/>
@@ -382,7 +307,7 @@
       </w:tr>
       <w:tr>
         <w:trPr>
-          <w:trHeight w:val="690"/>
+          <w:trHeight w:val="406"/>
         </w:trPr>
         <w:tc>
           <w:tcPr>
@@ -396,7 +321,6 @@
           </w:tcPr>
           <w:p>
             <w:pPr>
-              <w:spacing w:after="0"/>
               <w:ind w:left="2"/>
             </w:pPr>
             <w:r>
@@ -421,9 +345,6 @@
             <w:vAlign w:val="center"/>
           </w:tcPr>
           <w:p>
-            <w:pPr>
-              <w:spacing w:after="0"/>
-            </w:pPr>
             <w:r>
               <w:rPr>
                 <w:rFonts w:ascii="Arial" w:eastAsia="Arial" w:hAnsi="Arial" w:cs="Arial"/>

</xml_diff>